<commit_message>
fix: remove empty page between sections 7 and 8
Co-Authored-By: Claude Opus 4.6 (1M context) <noreply@anthropic.com>
</commit_message>
<xml_diff>
--- a/MyNextory_CoachAI_Scope.docx
+++ b/MyNextory_CoachAI_Scope.docx
@@ -8962,9 +8962,7 @@
       </w:tr>
     </w:tbl>
     <w:p>
-      <w:r>
-        <w:br w:type="page"/>
-      </w:r>
+      <w:r/>
     </w:p>
     <w:p>
       <w:bookmarkStart w:id="131" w:name="_Toc131"/>

</xml_diff>